<commit_message>
keep going anal the sys 01
</commit_message>
<xml_diff>
--- a/原神活跃度系统/原神活跃度系统拆解分析与迭代设计.docx
+++ b/原神活跃度系统/原神活跃度系统拆解分析与迭代设计.docx
@@ -2441,16 +2441,55 @@
           <w:rFonts w:eastAsiaTheme="minorHAnsi" w:hint="eastAsia"/>
           <w:szCs w:val="21"/>
         </w:rPr>
-        <w:t>对该子系统建立一个二维的评估模型：其主要纬度包含内容为：成本与反馈，其中成本代表玩家的投入，反馈代表玩家获得的价值与自主感</w:t>
-      </w:r>
-    </w:p>
-    <w:p>
-      <w:pPr>
-        <w:rPr>
-          <w:rFonts w:eastAsiaTheme="minorHAnsi"/>
+        <w:t>对该子系统建立一个二维的评估模型：其主要纬度包含内容为：</w:t>
+      </w:r>
+      <w:r>
+        <w:rPr>
+          <w:rFonts w:eastAsiaTheme="minorHAnsi" w:hint="eastAsia"/>
+          <w:b/>
+          <w:bCs/>
           <w:szCs w:val="21"/>
         </w:rPr>
-      </w:pPr>
+        <w:t>成本</w:t>
+      </w:r>
+      <w:r>
+        <w:rPr>
+          <w:rFonts w:eastAsiaTheme="minorHAnsi" w:hint="eastAsia"/>
+          <w:szCs w:val="21"/>
+        </w:rPr>
+        <w:t>与</w:t>
+      </w:r>
+      <w:r>
+        <w:rPr>
+          <w:rFonts w:eastAsiaTheme="minorHAnsi" w:hint="eastAsia"/>
+          <w:b/>
+          <w:bCs/>
+          <w:szCs w:val="21"/>
+        </w:rPr>
+        <w:t>反馈</w:t>
+      </w:r>
+      <w:r>
+        <w:rPr>
+          <w:rFonts w:eastAsiaTheme="minorHAnsi" w:hint="eastAsia"/>
+          <w:szCs w:val="21"/>
+        </w:rPr>
+        <w:t>，其中成本代表玩家的投入，反馈代表玩家获得的价值与自主感</w:t>
+      </w:r>
+    </w:p>
+    <w:p>
+      <w:pPr>
+        <w:rPr>
+          <w:rFonts w:eastAsiaTheme="minorHAnsi"/>
+          <w:szCs w:val="21"/>
+        </w:rPr>
+      </w:pPr>
+      <w:r>
+        <w:rPr>
+          <w:rFonts w:eastAsiaTheme="minorHAnsi" w:hint="eastAsia"/>
+          <w:szCs w:val="21"/>
+        </w:rPr>
+        <w:t>则</w:t>
+      </w:r>
       <w:r>
         <w:rPr>
           <w:rFonts w:eastAsiaTheme="minorHAnsi" w:hint="eastAsia"/>
@@ -2597,27 +2636,1674 @@
     <w:p>
       <w:pPr>
         <w:rPr>
-          <w:rFonts w:eastAsiaTheme="minorHAnsi" w:hint="eastAsia"/>
+          <w:rFonts w:eastAsiaTheme="minorHAnsi"/>
+          <w:szCs w:val="21"/>
+        </w:rPr>
+      </w:pPr>
+      <w:r>
+        <w:rPr>
+          <w:rFonts w:eastAsiaTheme="minorHAnsi"/>
+          <w:szCs w:val="21"/>
+        </w:rPr>
+        <w:t>原神的活跃度系统由 15 个子系统构成，分布在日、周、月、版本、年五个节奏档。</w:t>
+      </w:r>
+    </w:p>
+    <w:tbl>
+      <w:tblPr>
+        <w:tblW w:w="8222" w:type="dxa"/>
+        <w:jc w:val="center"/>
+        <w:tblBorders>
+          <w:top w:val="single" w:sz="4" w:space="0" w:color="D5DCE2"/>
+          <w:left w:val="single" w:sz="4" w:space="0" w:color="D5DCE2"/>
+          <w:bottom w:val="single" w:sz="4" w:space="0" w:color="D5DCE2"/>
+          <w:right w:val="single" w:sz="4" w:space="0" w:color="D5DCE2"/>
+          <w:insideH w:val="single" w:sz="4" w:space="0" w:color="D5DCE2"/>
+          <w:insideV w:val="single" w:sz="4" w:space="0" w:color="D5DCE2"/>
+        </w:tblBorders>
+        <w:tblLayout w:type="fixed"/>
+        <w:tblLook w:val="04A0" w:firstRow="1" w:lastRow="0" w:firstColumn="1" w:lastColumn="0" w:noHBand="0" w:noVBand="1"/>
+      </w:tblPr>
+      <w:tblGrid>
+        <w:gridCol w:w="2552"/>
+        <w:gridCol w:w="1559"/>
+        <w:gridCol w:w="2977"/>
+        <w:gridCol w:w="1134"/>
+      </w:tblGrid>
+      <w:tr>
+        <w:trPr>
+          <w:tblHeader/>
+          <w:jc w:val="center"/>
+        </w:trPr>
+        <w:tc>
+          <w:tcPr>
+            <w:tcW w:w="2552" w:type="dxa"/>
+            <w:shd w:val="clear" w:color="auto" w:fill="EEF2F6"/>
+          </w:tcPr>
+          <w:p>
+            <w:pPr>
+              <w:spacing w:before="30" w:after="30" w:line="276" w:lineRule="auto"/>
+              <w:jc w:val="center"/>
+              <w:rPr>
+                <w:rFonts w:eastAsiaTheme="minorHAnsi"/>
+                <w:szCs w:val="21"/>
+              </w:rPr>
+            </w:pPr>
+            <w:r>
+              <w:rPr>
+                <w:rFonts w:eastAsiaTheme="minorHAnsi"/>
+                <w:b/>
+                <w:szCs w:val="21"/>
+              </w:rPr>
+              <w:t>子系统</w:t>
+            </w:r>
+          </w:p>
+        </w:tc>
+        <w:tc>
+          <w:tcPr>
+            <w:tcW w:w="1559" w:type="dxa"/>
+            <w:shd w:val="clear" w:color="auto" w:fill="EEF2F6"/>
+          </w:tcPr>
+          <w:p>
+            <w:pPr>
+              <w:spacing w:before="30" w:after="30" w:line="276" w:lineRule="auto"/>
+              <w:jc w:val="center"/>
+              <w:rPr>
+                <w:rFonts w:eastAsiaTheme="minorHAnsi"/>
+                <w:szCs w:val="21"/>
+              </w:rPr>
+            </w:pPr>
+            <w:r>
+              <w:rPr>
+                <w:rFonts w:eastAsiaTheme="minorHAnsi"/>
+                <w:b/>
+                <w:szCs w:val="21"/>
+              </w:rPr>
+              <w:t>节奏</w:t>
+            </w:r>
+          </w:p>
+        </w:tc>
+        <w:tc>
+          <w:tcPr>
+            <w:tcW w:w="2977" w:type="dxa"/>
+            <w:shd w:val="clear" w:color="auto" w:fill="EEF2F6"/>
+          </w:tcPr>
+          <w:p>
+            <w:pPr>
+              <w:spacing w:before="30" w:after="30" w:line="276" w:lineRule="auto"/>
+              <w:jc w:val="center"/>
+              <w:rPr>
+                <w:rFonts w:eastAsiaTheme="minorHAnsi"/>
+                <w:szCs w:val="21"/>
+              </w:rPr>
+            </w:pPr>
+            <w:r>
+              <w:rPr>
+                <w:rFonts w:eastAsiaTheme="minorHAnsi"/>
+                <w:b/>
+                <w:szCs w:val="21"/>
+              </w:rPr>
+              <w:t>提供什么</w:t>
+            </w:r>
+          </w:p>
+        </w:tc>
+        <w:tc>
+          <w:tcPr>
+            <w:tcW w:w="1134" w:type="dxa"/>
+            <w:shd w:val="clear" w:color="auto" w:fill="EEF2F6"/>
+          </w:tcPr>
+          <w:p>
+            <w:pPr>
+              <w:spacing w:before="30" w:after="30" w:line="276" w:lineRule="auto"/>
+              <w:jc w:val="center"/>
+              <w:rPr>
+                <w:rFonts w:eastAsiaTheme="minorHAnsi"/>
+                <w:szCs w:val="21"/>
+              </w:rPr>
+            </w:pPr>
+            <w:r>
+              <w:rPr>
+                <w:rFonts w:eastAsiaTheme="minorHAnsi"/>
+                <w:b/>
+                <w:szCs w:val="21"/>
+              </w:rPr>
+              <w:t>杠杆</w:t>
+            </w:r>
+          </w:p>
+        </w:tc>
+      </w:tr>
+      <w:tr>
+        <w:trPr>
+          <w:cantSplit/>
+          <w:jc w:val="center"/>
+        </w:trPr>
+        <w:tc>
+          <w:tcPr>
+            <w:tcW w:w="2552" w:type="dxa"/>
+          </w:tcPr>
+          <w:p>
+            <w:pPr>
+              <w:spacing w:before="30" w:after="30" w:line="276" w:lineRule="auto"/>
+              <w:jc w:val="center"/>
+              <w:rPr>
+                <w:rFonts w:eastAsiaTheme="minorHAnsi"/>
+                <w:szCs w:val="21"/>
+              </w:rPr>
+            </w:pPr>
+            <w:r>
+              <w:rPr>
+                <w:rFonts w:eastAsiaTheme="minorHAnsi"/>
+                <w:szCs w:val="21"/>
+              </w:rPr>
+              <w:t>每日委托 / 历练点</w:t>
+            </w:r>
+          </w:p>
+        </w:tc>
+        <w:tc>
+          <w:tcPr>
+            <w:tcW w:w="1559" w:type="dxa"/>
+          </w:tcPr>
+          <w:p>
+            <w:pPr>
+              <w:spacing w:before="30" w:after="30" w:line="276" w:lineRule="auto"/>
+              <w:jc w:val="center"/>
+              <w:rPr>
+                <w:rFonts w:eastAsiaTheme="minorHAnsi"/>
+                <w:szCs w:val="21"/>
+              </w:rPr>
+            </w:pPr>
+            <w:r>
+              <w:rPr>
+                <w:rFonts w:eastAsiaTheme="minorHAnsi"/>
+                <w:szCs w:val="21"/>
+              </w:rPr>
+              <w:t>日</w:t>
+            </w:r>
+          </w:p>
+        </w:tc>
+        <w:tc>
+          <w:tcPr>
+            <w:tcW w:w="2977" w:type="dxa"/>
+          </w:tcPr>
+          <w:p>
+            <w:pPr>
+              <w:spacing w:before="30" w:after="30" w:line="276" w:lineRule="auto"/>
+              <w:jc w:val="center"/>
+              <w:rPr>
+                <w:rFonts w:eastAsiaTheme="minorHAnsi"/>
+                <w:szCs w:val="21"/>
+              </w:rPr>
+            </w:pPr>
+            <w:r>
+              <w:rPr>
+                <w:rFonts w:eastAsiaTheme="minorHAnsi"/>
+                <w:szCs w:val="21"/>
+              </w:rPr>
+              <w:t>原石、冒险阅历</w:t>
+            </w:r>
+          </w:p>
+        </w:tc>
+        <w:tc>
+          <w:tcPr>
+            <w:tcW w:w="1134" w:type="dxa"/>
+          </w:tcPr>
+          <w:p>
+            <w:pPr>
+              <w:spacing w:before="30" w:after="30" w:line="276" w:lineRule="auto"/>
+              <w:jc w:val="center"/>
+              <w:rPr>
+                <w:rFonts w:eastAsiaTheme="minorHAnsi"/>
+                <w:szCs w:val="21"/>
+              </w:rPr>
+            </w:pPr>
+            <w:r>
+              <w:rPr>
+                <w:rFonts w:eastAsiaTheme="minorHAnsi"/>
+                <w:szCs w:val="21"/>
+              </w:rPr>
+              <w:t>高</w:t>
+            </w:r>
+          </w:p>
+        </w:tc>
+      </w:tr>
+      <w:tr>
+        <w:trPr>
+          <w:cantSplit/>
+          <w:jc w:val="center"/>
+        </w:trPr>
+        <w:tc>
+          <w:tcPr>
+            <w:tcW w:w="2552" w:type="dxa"/>
+          </w:tcPr>
+          <w:p>
+            <w:pPr>
+              <w:spacing w:before="30" w:after="30" w:line="276" w:lineRule="auto"/>
+              <w:jc w:val="center"/>
+              <w:rPr>
+                <w:rFonts w:eastAsiaTheme="minorHAnsi"/>
+                <w:szCs w:val="21"/>
+              </w:rPr>
+            </w:pPr>
+            <w:r>
+              <w:rPr>
+                <w:rFonts w:eastAsiaTheme="minorHAnsi"/>
+                <w:szCs w:val="21"/>
+              </w:rPr>
+              <w:t>原粹树脂</w:t>
+            </w:r>
+          </w:p>
+        </w:tc>
+        <w:tc>
+          <w:tcPr>
+            <w:tcW w:w="1559" w:type="dxa"/>
+          </w:tcPr>
+          <w:p>
+            <w:pPr>
+              <w:spacing w:before="30" w:after="30" w:line="276" w:lineRule="auto"/>
+              <w:jc w:val="center"/>
+              <w:rPr>
+                <w:rFonts w:eastAsiaTheme="minorHAnsi"/>
+                <w:szCs w:val="21"/>
+              </w:rPr>
+            </w:pPr>
+            <w:r>
+              <w:rPr>
+                <w:rFonts w:eastAsiaTheme="minorHAnsi"/>
+                <w:szCs w:val="21"/>
+              </w:rPr>
+              <w:t>日</w:t>
+            </w:r>
+          </w:p>
+        </w:tc>
+        <w:tc>
+          <w:tcPr>
+            <w:tcW w:w="2977" w:type="dxa"/>
+          </w:tcPr>
+          <w:p>
+            <w:pPr>
+              <w:spacing w:before="30" w:after="30" w:line="276" w:lineRule="auto"/>
+              <w:jc w:val="center"/>
+              <w:rPr>
+                <w:rFonts w:eastAsiaTheme="minorHAnsi"/>
+                <w:szCs w:val="21"/>
+              </w:rPr>
+            </w:pPr>
+            <w:r>
+              <w:rPr>
+                <w:rFonts w:eastAsiaTheme="minorHAnsi"/>
+                <w:szCs w:val="21"/>
+              </w:rPr>
+              <w:t>养成素材</w:t>
+            </w:r>
+          </w:p>
+        </w:tc>
+        <w:tc>
+          <w:tcPr>
+            <w:tcW w:w="1134" w:type="dxa"/>
+          </w:tcPr>
+          <w:p>
+            <w:pPr>
+              <w:spacing w:before="30" w:after="30" w:line="276" w:lineRule="auto"/>
+              <w:jc w:val="center"/>
+              <w:rPr>
+                <w:rFonts w:eastAsiaTheme="minorHAnsi"/>
+                <w:szCs w:val="21"/>
+              </w:rPr>
+            </w:pPr>
+            <w:r>
+              <w:rPr>
+                <w:rFonts w:eastAsiaTheme="minorHAnsi"/>
+                <w:szCs w:val="21"/>
+              </w:rPr>
+              <w:t>高</w:t>
+            </w:r>
+          </w:p>
+        </w:tc>
+      </w:tr>
+      <w:tr>
+        <w:trPr>
+          <w:cantSplit/>
+          <w:jc w:val="center"/>
+        </w:trPr>
+        <w:tc>
+          <w:tcPr>
+            <w:tcW w:w="2552" w:type="dxa"/>
+          </w:tcPr>
+          <w:p>
+            <w:pPr>
+              <w:spacing w:before="30" w:after="30" w:line="276" w:lineRule="auto"/>
+              <w:jc w:val="center"/>
+              <w:rPr>
+                <w:rFonts w:eastAsiaTheme="minorHAnsi"/>
+                <w:szCs w:val="21"/>
+              </w:rPr>
+            </w:pPr>
+            <w:r>
+              <w:rPr>
+                <w:rFonts w:eastAsiaTheme="minorHAnsi"/>
+                <w:szCs w:val="21"/>
+              </w:rPr>
+              <w:lastRenderedPageBreak/>
+              <w:t>纪行</w:t>
+            </w:r>
+          </w:p>
+        </w:tc>
+        <w:tc>
+          <w:tcPr>
+            <w:tcW w:w="1559" w:type="dxa"/>
+          </w:tcPr>
+          <w:p>
+            <w:pPr>
+              <w:spacing w:before="30" w:after="30" w:line="276" w:lineRule="auto"/>
+              <w:jc w:val="center"/>
+              <w:rPr>
+                <w:rFonts w:eastAsiaTheme="minorHAnsi"/>
+                <w:szCs w:val="21"/>
+              </w:rPr>
+            </w:pPr>
+            <w:r>
+              <w:rPr>
+                <w:rFonts w:eastAsiaTheme="minorHAnsi"/>
+                <w:szCs w:val="21"/>
+              </w:rPr>
+              <w:t>周/版本</w:t>
+            </w:r>
+          </w:p>
+        </w:tc>
+        <w:tc>
+          <w:tcPr>
+            <w:tcW w:w="2977" w:type="dxa"/>
+          </w:tcPr>
+          <w:p>
+            <w:pPr>
+              <w:spacing w:before="30" w:after="30" w:line="276" w:lineRule="auto"/>
+              <w:jc w:val="center"/>
+              <w:rPr>
+                <w:rFonts w:eastAsiaTheme="minorHAnsi"/>
+                <w:szCs w:val="21"/>
+              </w:rPr>
+            </w:pPr>
+            <w:r>
+              <w:rPr>
+                <w:rFonts w:eastAsiaTheme="minorHAnsi"/>
+                <w:szCs w:val="21"/>
+              </w:rPr>
+              <w:t>资源、抽卡券</w:t>
+            </w:r>
+          </w:p>
+        </w:tc>
+        <w:tc>
+          <w:tcPr>
+            <w:tcW w:w="1134" w:type="dxa"/>
+          </w:tcPr>
+          <w:p>
+            <w:pPr>
+              <w:spacing w:before="30" w:after="30" w:line="276" w:lineRule="auto"/>
+              <w:jc w:val="center"/>
+              <w:rPr>
+                <w:rFonts w:eastAsiaTheme="minorHAnsi"/>
+                <w:szCs w:val="21"/>
+              </w:rPr>
+            </w:pPr>
+            <w:r>
+              <w:rPr>
+                <w:rFonts w:eastAsiaTheme="minorHAnsi"/>
+                <w:szCs w:val="21"/>
+              </w:rPr>
+              <w:t>高</w:t>
+            </w:r>
+          </w:p>
+        </w:tc>
+      </w:tr>
+      <w:tr>
+        <w:trPr>
+          <w:cantSplit/>
+          <w:jc w:val="center"/>
+        </w:trPr>
+        <w:tc>
+          <w:tcPr>
+            <w:tcW w:w="2552" w:type="dxa"/>
+          </w:tcPr>
+          <w:p>
+            <w:pPr>
+              <w:spacing w:before="30" w:after="30" w:line="276" w:lineRule="auto"/>
+              <w:jc w:val="center"/>
+              <w:rPr>
+                <w:rFonts w:eastAsiaTheme="minorHAnsi"/>
+                <w:szCs w:val="21"/>
+              </w:rPr>
+            </w:pPr>
+            <w:r>
+              <w:rPr>
+                <w:rFonts w:eastAsiaTheme="minorHAnsi"/>
+                <w:szCs w:val="21"/>
+              </w:rPr>
+              <w:t>周本</w:t>
+            </w:r>
+          </w:p>
+        </w:tc>
+        <w:tc>
+          <w:tcPr>
+            <w:tcW w:w="1559" w:type="dxa"/>
+          </w:tcPr>
+          <w:p>
+            <w:pPr>
+              <w:spacing w:before="30" w:after="30" w:line="276" w:lineRule="auto"/>
+              <w:jc w:val="center"/>
+              <w:rPr>
+                <w:rFonts w:eastAsiaTheme="minorHAnsi"/>
+                <w:szCs w:val="21"/>
+              </w:rPr>
+            </w:pPr>
+            <w:r>
+              <w:rPr>
+                <w:rFonts w:eastAsiaTheme="minorHAnsi"/>
+                <w:szCs w:val="21"/>
+              </w:rPr>
+              <w:t>周</w:t>
+            </w:r>
+          </w:p>
+        </w:tc>
+        <w:tc>
+          <w:tcPr>
+            <w:tcW w:w="2977" w:type="dxa"/>
+          </w:tcPr>
+          <w:p>
+            <w:pPr>
+              <w:spacing w:before="30" w:after="30" w:line="276" w:lineRule="auto"/>
+              <w:jc w:val="center"/>
+              <w:rPr>
+                <w:rFonts w:eastAsiaTheme="minorHAnsi"/>
+                <w:szCs w:val="21"/>
+              </w:rPr>
+            </w:pPr>
+            <w:r>
+              <w:rPr>
+                <w:rFonts w:eastAsiaTheme="minorHAnsi"/>
+                <w:szCs w:val="21"/>
+              </w:rPr>
+              <w:t>突破素材</w:t>
+            </w:r>
+          </w:p>
+        </w:tc>
+        <w:tc>
+          <w:tcPr>
+            <w:tcW w:w="1134" w:type="dxa"/>
+          </w:tcPr>
+          <w:p>
+            <w:pPr>
+              <w:spacing w:before="30" w:after="30" w:line="276" w:lineRule="auto"/>
+              <w:jc w:val="center"/>
+              <w:rPr>
+                <w:rFonts w:eastAsiaTheme="minorHAnsi"/>
+                <w:szCs w:val="21"/>
+              </w:rPr>
+            </w:pPr>
+            <w:r>
+              <w:rPr>
+                <w:rFonts w:eastAsiaTheme="minorHAnsi"/>
+                <w:szCs w:val="21"/>
+              </w:rPr>
+              <w:t>高</w:t>
+            </w:r>
+          </w:p>
+        </w:tc>
+      </w:tr>
+      <w:tr>
+        <w:trPr>
+          <w:cantSplit/>
+          <w:jc w:val="center"/>
+        </w:trPr>
+        <w:tc>
+          <w:tcPr>
+            <w:tcW w:w="2552" w:type="dxa"/>
+          </w:tcPr>
+          <w:p>
+            <w:pPr>
+              <w:spacing w:before="30" w:after="30" w:line="276" w:lineRule="auto"/>
+              <w:jc w:val="center"/>
+              <w:rPr>
+                <w:rFonts w:eastAsiaTheme="minorHAnsi"/>
+                <w:szCs w:val="21"/>
+              </w:rPr>
+            </w:pPr>
+            <w:r>
+              <w:rPr>
+                <w:rFonts w:eastAsiaTheme="minorHAnsi"/>
+                <w:szCs w:val="21"/>
+              </w:rPr>
+              <w:t>深境螺旋</w:t>
+            </w:r>
+          </w:p>
+        </w:tc>
+        <w:tc>
+          <w:tcPr>
+            <w:tcW w:w="1559" w:type="dxa"/>
+          </w:tcPr>
+          <w:p>
+            <w:pPr>
+              <w:spacing w:before="30" w:after="30" w:line="276" w:lineRule="auto"/>
+              <w:jc w:val="center"/>
+              <w:rPr>
+                <w:rFonts w:eastAsiaTheme="minorHAnsi" w:hint="eastAsia"/>
+                <w:szCs w:val="21"/>
+              </w:rPr>
+            </w:pPr>
+            <w:r>
+              <w:rPr>
+                <w:rFonts w:eastAsiaTheme="minorHAnsi" w:hint="eastAsia"/>
+                <w:szCs w:val="21"/>
+              </w:rPr>
+              <w:t>每</w:t>
+            </w:r>
+            <w:r>
+              <w:rPr>
+                <w:rFonts w:eastAsiaTheme="minorHAnsi"/>
+                <w:szCs w:val="21"/>
+              </w:rPr>
+              <w:t>月16日</w:t>
+            </w:r>
+          </w:p>
+        </w:tc>
+        <w:tc>
+          <w:tcPr>
+            <w:tcW w:w="2977" w:type="dxa"/>
+          </w:tcPr>
+          <w:p>
+            <w:pPr>
+              <w:spacing w:before="30" w:after="30" w:line="276" w:lineRule="auto"/>
+              <w:jc w:val="center"/>
+              <w:rPr>
+                <w:rFonts w:eastAsiaTheme="minorHAnsi"/>
+                <w:szCs w:val="21"/>
+              </w:rPr>
+            </w:pPr>
+            <w:r>
+              <w:rPr>
+                <w:rFonts w:eastAsiaTheme="minorHAnsi"/>
+                <w:szCs w:val="21"/>
+              </w:rPr>
+              <w:t>原石、练度验证</w:t>
+            </w:r>
+          </w:p>
+        </w:tc>
+        <w:tc>
+          <w:tcPr>
+            <w:tcW w:w="1134" w:type="dxa"/>
+          </w:tcPr>
+          <w:p>
+            <w:pPr>
+              <w:spacing w:before="30" w:after="30" w:line="276" w:lineRule="auto"/>
+              <w:jc w:val="center"/>
+              <w:rPr>
+                <w:rFonts w:eastAsiaTheme="minorHAnsi"/>
+                <w:szCs w:val="21"/>
+              </w:rPr>
+            </w:pPr>
+            <w:r>
+              <w:rPr>
+                <w:rFonts w:eastAsiaTheme="minorHAnsi"/>
+                <w:szCs w:val="21"/>
+              </w:rPr>
+              <w:t>中</w:t>
+            </w:r>
+          </w:p>
+        </w:tc>
+      </w:tr>
+      <w:tr>
+        <w:trPr>
+          <w:cantSplit/>
+          <w:jc w:val="center"/>
+        </w:trPr>
+        <w:tc>
+          <w:tcPr>
+            <w:tcW w:w="2552" w:type="dxa"/>
+          </w:tcPr>
+          <w:p>
+            <w:pPr>
+              <w:spacing w:before="30" w:after="30" w:line="276" w:lineRule="auto"/>
+              <w:jc w:val="center"/>
+              <w:rPr>
+                <w:rFonts w:eastAsiaTheme="minorHAnsi"/>
+                <w:szCs w:val="21"/>
+              </w:rPr>
+            </w:pPr>
+            <w:r>
+              <w:rPr>
+                <w:rFonts w:eastAsiaTheme="minorHAnsi"/>
+                <w:szCs w:val="21"/>
+              </w:rPr>
+              <w:t>幻想真境剧诗</w:t>
+            </w:r>
+          </w:p>
+        </w:tc>
+        <w:tc>
+          <w:tcPr>
+            <w:tcW w:w="1559" w:type="dxa"/>
+          </w:tcPr>
+          <w:p>
+            <w:pPr>
+              <w:spacing w:before="30" w:after="30" w:line="276" w:lineRule="auto"/>
+              <w:jc w:val="center"/>
+              <w:rPr>
+                <w:rFonts w:eastAsiaTheme="minorHAnsi" w:hint="eastAsia"/>
+                <w:szCs w:val="21"/>
+              </w:rPr>
+            </w:pPr>
+            <w:r>
+              <w:rPr>
+                <w:rFonts w:eastAsiaTheme="minorHAnsi" w:hint="eastAsia"/>
+                <w:szCs w:val="21"/>
+              </w:rPr>
+              <w:t>每</w:t>
+            </w:r>
+            <w:r>
+              <w:rPr>
+                <w:rFonts w:eastAsiaTheme="minorHAnsi"/>
+                <w:szCs w:val="21"/>
+              </w:rPr>
+              <w:t>月</w:t>
+            </w:r>
+            <w:r>
+              <w:rPr>
+                <w:rFonts w:eastAsiaTheme="minorHAnsi" w:hint="eastAsia"/>
+                <w:szCs w:val="21"/>
+              </w:rPr>
+              <w:t>1日</w:t>
+            </w:r>
+          </w:p>
+        </w:tc>
+        <w:tc>
+          <w:tcPr>
+            <w:tcW w:w="2977" w:type="dxa"/>
+          </w:tcPr>
+          <w:p>
+            <w:pPr>
+              <w:spacing w:before="30" w:after="30" w:line="276" w:lineRule="auto"/>
+              <w:jc w:val="center"/>
+              <w:rPr>
+                <w:rFonts w:eastAsiaTheme="minorHAnsi"/>
+                <w:szCs w:val="21"/>
+              </w:rPr>
+            </w:pPr>
+            <w:r>
+              <w:rPr>
+                <w:rFonts w:eastAsiaTheme="minorHAnsi"/>
+                <w:szCs w:val="21"/>
+              </w:rPr>
+              <w:t>原石、角色复用</w:t>
+            </w:r>
+          </w:p>
+        </w:tc>
+        <w:tc>
+          <w:tcPr>
+            <w:tcW w:w="1134" w:type="dxa"/>
+          </w:tcPr>
+          <w:p>
+            <w:pPr>
+              <w:spacing w:before="30" w:after="30" w:line="276" w:lineRule="auto"/>
+              <w:jc w:val="center"/>
+              <w:rPr>
+                <w:rFonts w:eastAsiaTheme="minorHAnsi"/>
+                <w:szCs w:val="21"/>
+              </w:rPr>
+            </w:pPr>
+            <w:r>
+              <w:rPr>
+                <w:rFonts w:eastAsiaTheme="minorHAnsi"/>
+                <w:szCs w:val="21"/>
+              </w:rPr>
+              <w:t>中</w:t>
+            </w:r>
+          </w:p>
+        </w:tc>
+      </w:tr>
+      <w:tr>
+        <w:trPr>
+          <w:cantSplit/>
+          <w:jc w:val="center"/>
+        </w:trPr>
+        <w:tc>
+          <w:tcPr>
+            <w:tcW w:w="2552" w:type="dxa"/>
+          </w:tcPr>
+          <w:p>
+            <w:pPr>
+              <w:spacing w:before="30" w:after="30" w:line="276" w:lineRule="auto"/>
+              <w:jc w:val="center"/>
+              <w:rPr>
+                <w:rFonts w:eastAsiaTheme="minorHAnsi"/>
+                <w:szCs w:val="21"/>
+              </w:rPr>
+            </w:pPr>
+            <w:r>
+              <w:rPr>
+                <w:rFonts w:eastAsiaTheme="minorHAnsi"/>
+                <w:szCs w:val="21"/>
+              </w:rPr>
+              <w:t>幽境危战</w:t>
+            </w:r>
+          </w:p>
+        </w:tc>
+        <w:tc>
+          <w:tcPr>
+            <w:tcW w:w="1559" w:type="dxa"/>
+          </w:tcPr>
+          <w:p>
+            <w:pPr>
+              <w:spacing w:before="30" w:after="30" w:line="276" w:lineRule="auto"/>
+              <w:jc w:val="center"/>
+              <w:rPr>
+                <w:rFonts w:eastAsiaTheme="minorHAnsi"/>
+                <w:szCs w:val="21"/>
+              </w:rPr>
+            </w:pPr>
+            <w:r>
+              <w:rPr>
+                <w:rFonts w:eastAsiaTheme="minorHAnsi"/>
+                <w:szCs w:val="21"/>
+              </w:rPr>
+              <w:t>限时</w:t>
+            </w:r>
+          </w:p>
+        </w:tc>
+        <w:tc>
+          <w:tcPr>
+            <w:tcW w:w="2977" w:type="dxa"/>
+          </w:tcPr>
+          <w:p>
+            <w:pPr>
+              <w:spacing w:before="30" w:after="30" w:line="276" w:lineRule="auto"/>
+              <w:jc w:val="center"/>
+              <w:rPr>
+                <w:rFonts w:eastAsiaTheme="minorHAnsi"/>
+                <w:szCs w:val="21"/>
+              </w:rPr>
+            </w:pPr>
+            <w:r>
+              <w:rPr>
+                <w:rFonts w:eastAsiaTheme="minorHAnsi"/>
+                <w:szCs w:val="21"/>
+              </w:rPr>
+              <w:t>原石、高难</w:t>
+            </w:r>
+          </w:p>
+        </w:tc>
+        <w:tc>
+          <w:tcPr>
+            <w:tcW w:w="1134" w:type="dxa"/>
+          </w:tcPr>
+          <w:p>
+            <w:pPr>
+              <w:spacing w:before="30" w:after="30" w:line="276" w:lineRule="auto"/>
+              <w:jc w:val="center"/>
+              <w:rPr>
+                <w:rFonts w:eastAsiaTheme="minorHAnsi"/>
+                <w:szCs w:val="21"/>
+              </w:rPr>
+            </w:pPr>
+            <w:r>
+              <w:rPr>
+                <w:rFonts w:eastAsiaTheme="minorHAnsi"/>
+                <w:szCs w:val="21"/>
+              </w:rPr>
+              <w:t>低</w:t>
+            </w:r>
+          </w:p>
+        </w:tc>
+      </w:tr>
+      <w:tr>
+        <w:trPr>
+          <w:cantSplit/>
+          <w:jc w:val="center"/>
+        </w:trPr>
+        <w:tc>
+          <w:tcPr>
+            <w:tcW w:w="2552" w:type="dxa"/>
+          </w:tcPr>
+          <w:p>
+            <w:pPr>
+              <w:spacing w:before="30" w:after="30" w:line="276" w:lineRule="auto"/>
+              <w:jc w:val="center"/>
+              <w:rPr>
+                <w:rFonts w:eastAsiaTheme="minorHAnsi"/>
+                <w:szCs w:val="21"/>
+              </w:rPr>
+            </w:pPr>
+            <w:r>
+              <w:rPr>
+                <w:rFonts w:eastAsiaTheme="minorHAnsi"/>
+                <w:szCs w:val="21"/>
+              </w:rPr>
+              <w:t>版本活动</w:t>
+            </w:r>
+          </w:p>
+        </w:tc>
+        <w:tc>
+          <w:tcPr>
+            <w:tcW w:w="1559" w:type="dxa"/>
+          </w:tcPr>
+          <w:p>
+            <w:pPr>
+              <w:spacing w:before="30" w:after="30" w:line="276" w:lineRule="auto"/>
+              <w:jc w:val="center"/>
+              <w:rPr>
+                <w:rFonts w:eastAsiaTheme="minorHAnsi"/>
+                <w:szCs w:val="21"/>
+              </w:rPr>
+            </w:pPr>
+            <w:r>
+              <w:rPr>
+                <w:rFonts w:eastAsiaTheme="minorHAnsi"/>
+                <w:szCs w:val="21"/>
+              </w:rPr>
+              <w:t>版本</w:t>
+            </w:r>
+          </w:p>
+        </w:tc>
+        <w:tc>
+          <w:tcPr>
+            <w:tcW w:w="2977" w:type="dxa"/>
+          </w:tcPr>
+          <w:p>
+            <w:pPr>
+              <w:spacing w:before="30" w:after="30" w:line="276" w:lineRule="auto"/>
+              <w:jc w:val="center"/>
+              <w:rPr>
+                <w:rFonts w:eastAsiaTheme="minorHAnsi"/>
+                <w:szCs w:val="21"/>
+              </w:rPr>
+            </w:pPr>
+            <w:r>
+              <w:rPr>
+                <w:rFonts w:eastAsiaTheme="minorHAnsi"/>
+                <w:szCs w:val="21"/>
+              </w:rPr>
+              <w:t>新玩法、原石</w:t>
+            </w:r>
+          </w:p>
+        </w:tc>
+        <w:tc>
+          <w:tcPr>
+            <w:tcW w:w="1134" w:type="dxa"/>
+          </w:tcPr>
+          <w:p>
+            <w:pPr>
+              <w:spacing w:before="30" w:after="30" w:line="276" w:lineRule="auto"/>
+              <w:jc w:val="center"/>
+              <w:rPr>
+                <w:rFonts w:eastAsiaTheme="minorHAnsi"/>
+                <w:szCs w:val="21"/>
+              </w:rPr>
+            </w:pPr>
+            <w:r>
+              <w:rPr>
+                <w:rFonts w:eastAsiaTheme="minorHAnsi"/>
+                <w:szCs w:val="21"/>
+              </w:rPr>
+              <w:t>低</w:t>
+            </w:r>
+          </w:p>
+        </w:tc>
+      </w:tr>
+      <w:tr>
+        <w:trPr>
+          <w:cantSplit/>
+          <w:jc w:val="center"/>
+        </w:trPr>
+        <w:tc>
+          <w:tcPr>
+            <w:tcW w:w="2552" w:type="dxa"/>
+          </w:tcPr>
+          <w:p>
+            <w:pPr>
+              <w:spacing w:before="30" w:after="30" w:line="276" w:lineRule="auto"/>
+              <w:jc w:val="center"/>
+              <w:rPr>
+                <w:rFonts w:eastAsiaTheme="minorHAnsi"/>
+                <w:szCs w:val="21"/>
+              </w:rPr>
+            </w:pPr>
+            <w:r>
+              <w:rPr>
+                <w:rFonts w:eastAsiaTheme="minorHAnsi"/>
+                <w:szCs w:val="21"/>
+              </w:rPr>
+              <w:t>大世界探索</w:t>
+            </w:r>
+          </w:p>
+        </w:tc>
+        <w:tc>
+          <w:tcPr>
+            <w:tcW w:w="1559" w:type="dxa"/>
+          </w:tcPr>
+          <w:p>
+            <w:pPr>
+              <w:spacing w:before="30" w:after="30" w:line="276" w:lineRule="auto"/>
+              <w:jc w:val="center"/>
+              <w:rPr>
+                <w:rFonts w:eastAsiaTheme="minorHAnsi"/>
+                <w:szCs w:val="21"/>
+              </w:rPr>
+            </w:pPr>
+            <w:r>
+              <w:rPr>
+                <w:rFonts w:eastAsiaTheme="minorHAnsi"/>
+                <w:szCs w:val="21"/>
+              </w:rPr>
+              <w:t>版本/长线</w:t>
+            </w:r>
+          </w:p>
+        </w:tc>
+        <w:tc>
+          <w:tcPr>
+            <w:tcW w:w="2977" w:type="dxa"/>
+          </w:tcPr>
+          <w:p>
+            <w:pPr>
+              <w:spacing w:before="30" w:after="30" w:line="276" w:lineRule="auto"/>
+              <w:jc w:val="center"/>
+              <w:rPr>
+                <w:rFonts w:eastAsiaTheme="minorHAnsi"/>
+                <w:szCs w:val="21"/>
+              </w:rPr>
+            </w:pPr>
+            <w:r>
+              <w:rPr>
+                <w:rFonts w:eastAsiaTheme="minorHAnsi"/>
+                <w:szCs w:val="21"/>
+              </w:rPr>
+              <w:t>地图、叙事</w:t>
+            </w:r>
+          </w:p>
+        </w:tc>
+        <w:tc>
+          <w:tcPr>
+            <w:tcW w:w="1134" w:type="dxa"/>
+          </w:tcPr>
+          <w:p>
+            <w:pPr>
+              <w:spacing w:before="30" w:after="30" w:line="276" w:lineRule="auto"/>
+              <w:jc w:val="center"/>
+              <w:rPr>
+                <w:rFonts w:eastAsiaTheme="minorHAnsi"/>
+                <w:szCs w:val="21"/>
+              </w:rPr>
+            </w:pPr>
+            <w:r>
+              <w:rPr>
+                <w:rFonts w:eastAsiaTheme="minorHAnsi"/>
+                <w:szCs w:val="21"/>
+              </w:rPr>
+              <w:t>低</w:t>
+            </w:r>
+          </w:p>
+        </w:tc>
+      </w:tr>
+      <w:tr>
+        <w:trPr>
+          <w:cantSplit/>
+          <w:jc w:val="center"/>
+        </w:trPr>
+        <w:tc>
+          <w:tcPr>
+            <w:tcW w:w="2552" w:type="dxa"/>
+          </w:tcPr>
+          <w:p>
+            <w:pPr>
+              <w:spacing w:before="30" w:after="30" w:line="276" w:lineRule="auto"/>
+              <w:jc w:val="center"/>
+              <w:rPr>
+                <w:rFonts w:eastAsiaTheme="minorHAnsi"/>
+                <w:szCs w:val="21"/>
+              </w:rPr>
+            </w:pPr>
+            <w:r>
+              <w:rPr>
+                <w:rFonts w:eastAsiaTheme="minorHAnsi"/>
+                <w:szCs w:val="21"/>
+              </w:rPr>
+              <w:t>剧情 / 传说任务</w:t>
+            </w:r>
+          </w:p>
+        </w:tc>
+        <w:tc>
+          <w:tcPr>
+            <w:tcW w:w="1559" w:type="dxa"/>
+          </w:tcPr>
+          <w:p>
+            <w:pPr>
+              <w:spacing w:before="30" w:after="30" w:line="276" w:lineRule="auto"/>
+              <w:jc w:val="center"/>
+              <w:rPr>
+                <w:rFonts w:eastAsiaTheme="minorHAnsi"/>
+                <w:szCs w:val="21"/>
+              </w:rPr>
+            </w:pPr>
+            <w:r>
+              <w:rPr>
+                <w:rFonts w:eastAsiaTheme="minorHAnsi"/>
+                <w:szCs w:val="21"/>
+              </w:rPr>
+              <w:t>版本/长线</w:t>
+            </w:r>
+          </w:p>
+        </w:tc>
+        <w:tc>
+          <w:tcPr>
+            <w:tcW w:w="2977" w:type="dxa"/>
+          </w:tcPr>
+          <w:p>
+            <w:pPr>
+              <w:spacing w:before="30" w:after="30" w:line="276" w:lineRule="auto"/>
+              <w:jc w:val="center"/>
+              <w:rPr>
+                <w:rFonts w:eastAsiaTheme="minorHAnsi"/>
+                <w:szCs w:val="21"/>
+              </w:rPr>
+            </w:pPr>
+            <w:r>
+              <w:rPr>
+                <w:rFonts w:eastAsiaTheme="minorHAnsi"/>
+                <w:szCs w:val="21"/>
+              </w:rPr>
+              <w:t>角色、世界观</w:t>
+            </w:r>
+          </w:p>
+        </w:tc>
+        <w:tc>
+          <w:tcPr>
+            <w:tcW w:w="1134" w:type="dxa"/>
+          </w:tcPr>
+          <w:p>
+            <w:pPr>
+              <w:spacing w:before="30" w:after="30" w:line="276" w:lineRule="auto"/>
+              <w:jc w:val="center"/>
+              <w:rPr>
+                <w:rFonts w:eastAsiaTheme="minorHAnsi"/>
+                <w:szCs w:val="21"/>
+              </w:rPr>
+            </w:pPr>
+            <w:r>
+              <w:rPr>
+                <w:rFonts w:eastAsiaTheme="minorHAnsi"/>
+                <w:szCs w:val="21"/>
+              </w:rPr>
+              <w:t>低</w:t>
+            </w:r>
+          </w:p>
+        </w:tc>
+      </w:tr>
+      <w:tr>
+        <w:trPr>
+          <w:cantSplit/>
+          <w:jc w:val="center"/>
+        </w:trPr>
+        <w:tc>
+          <w:tcPr>
+            <w:tcW w:w="2552" w:type="dxa"/>
+          </w:tcPr>
+          <w:p>
+            <w:pPr>
+              <w:spacing w:before="30" w:after="30" w:line="276" w:lineRule="auto"/>
+              <w:jc w:val="center"/>
+              <w:rPr>
+                <w:rFonts w:eastAsiaTheme="minorHAnsi"/>
+                <w:szCs w:val="21"/>
+              </w:rPr>
+            </w:pPr>
+            <w:r>
+              <w:rPr>
+                <w:rFonts w:eastAsiaTheme="minorHAnsi"/>
+                <w:szCs w:val="21"/>
+              </w:rPr>
+              <w:t>尘歌壶</w:t>
+            </w:r>
+          </w:p>
+        </w:tc>
+        <w:tc>
+          <w:tcPr>
+            <w:tcW w:w="1559" w:type="dxa"/>
+          </w:tcPr>
+          <w:p>
+            <w:pPr>
+              <w:spacing w:before="30" w:after="30" w:line="276" w:lineRule="auto"/>
+              <w:jc w:val="center"/>
+              <w:rPr>
+                <w:rFonts w:eastAsiaTheme="minorHAnsi"/>
+                <w:szCs w:val="21"/>
+              </w:rPr>
+            </w:pPr>
+            <w:r>
+              <w:rPr>
+                <w:rFonts w:eastAsiaTheme="minorHAnsi"/>
+                <w:szCs w:val="21"/>
+              </w:rPr>
+              <w:t>长线</w:t>
+            </w:r>
+          </w:p>
+        </w:tc>
+        <w:tc>
+          <w:tcPr>
+            <w:tcW w:w="2977" w:type="dxa"/>
+          </w:tcPr>
+          <w:p>
+            <w:pPr>
+              <w:spacing w:before="30" w:after="30" w:line="276" w:lineRule="auto"/>
+              <w:jc w:val="center"/>
+              <w:rPr>
+                <w:rFonts w:eastAsiaTheme="minorHAnsi"/>
+                <w:szCs w:val="21"/>
+              </w:rPr>
+            </w:pPr>
+            <w:r>
+              <w:rPr>
+                <w:rFonts w:eastAsiaTheme="minorHAnsi"/>
+                <w:szCs w:val="21"/>
+              </w:rPr>
+              <w:t>建造、展示</w:t>
+            </w:r>
+          </w:p>
+        </w:tc>
+        <w:tc>
+          <w:tcPr>
+            <w:tcW w:w="1134" w:type="dxa"/>
+          </w:tcPr>
+          <w:p>
+            <w:pPr>
+              <w:spacing w:before="30" w:after="30" w:line="276" w:lineRule="auto"/>
+              <w:jc w:val="center"/>
+              <w:rPr>
+                <w:rFonts w:eastAsiaTheme="minorHAnsi"/>
+                <w:szCs w:val="21"/>
+              </w:rPr>
+            </w:pPr>
+            <w:r>
+              <w:rPr>
+                <w:rFonts w:eastAsiaTheme="minorHAnsi"/>
+                <w:szCs w:val="21"/>
+              </w:rPr>
+              <w:t>中</w:t>
+            </w:r>
+          </w:p>
+        </w:tc>
+      </w:tr>
+      <w:tr>
+        <w:trPr>
+          <w:cantSplit/>
+          <w:jc w:val="center"/>
+        </w:trPr>
+        <w:tc>
+          <w:tcPr>
+            <w:tcW w:w="2552" w:type="dxa"/>
+          </w:tcPr>
+          <w:p>
+            <w:pPr>
+              <w:spacing w:before="30" w:after="30" w:line="276" w:lineRule="auto"/>
+              <w:jc w:val="center"/>
+              <w:rPr>
+                <w:rFonts w:eastAsiaTheme="minorHAnsi"/>
+                <w:szCs w:val="21"/>
+              </w:rPr>
+            </w:pPr>
+            <w:r>
+              <w:rPr>
+                <w:rFonts w:eastAsiaTheme="minorHAnsi"/>
+                <w:szCs w:val="21"/>
+              </w:rPr>
+              <w:t>七圣召唤</w:t>
+            </w:r>
+          </w:p>
+        </w:tc>
+        <w:tc>
+          <w:tcPr>
+            <w:tcW w:w="1559" w:type="dxa"/>
+          </w:tcPr>
+          <w:p>
+            <w:pPr>
+              <w:spacing w:before="30" w:after="30" w:line="276" w:lineRule="auto"/>
+              <w:jc w:val="center"/>
+              <w:rPr>
+                <w:rFonts w:eastAsiaTheme="minorHAnsi"/>
+                <w:szCs w:val="21"/>
+              </w:rPr>
+            </w:pPr>
+            <w:r>
+              <w:rPr>
+                <w:rFonts w:eastAsiaTheme="minorHAnsi"/>
+                <w:szCs w:val="21"/>
+              </w:rPr>
+              <w:t>长线</w:t>
+            </w:r>
+          </w:p>
+        </w:tc>
+        <w:tc>
+          <w:tcPr>
+            <w:tcW w:w="2977" w:type="dxa"/>
+          </w:tcPr>
+          <w:p>
+            <w:pPr>
+              <w:spacing w:before="30" w:after="30" w:line="276" w:lineRule="auto"/>
+              <w:jc w:val="center"/>
+              <w:rPr>
+                <w:rFonts w:eastAsiaTheme="minorHAnsi"/>
+                <w:szCs w:val="21"/>
+              </w:rPr>
+            </w:pPr>
+            <w:r>
+              <w:rPr>
+                <w:rFonts w:eastAsiaTheme="minorHAnsi"/>
+                <w:szCs w:val="21"/>
+              </w:rPr>
+              <w:t>卡牌对战</w:t>
+            </w:r>
+          </w:p>
+        </w:tc>
+        <w:tc>
+          <w:tcPr>
+            <w:tcW w:w="1134" w:type="dxa"/>
+          </w:tcPr>
+          <w:p>
+            <w:pPr>
+              <w:spacing w:before="30" w:after="30" w:line="276" w:lineRule="auto"/>
+              <w:jc w:val="center"/>
+              <w:rPr>
+                <w:rFonts w:eastAsiaTheme="minorHAnsi"/>
+                <w:szCs w:val="21"/>
+              </w:rPr>
+            </w:pPr>
+            <w:r>
+              <w:rPr>
+                <w:rFonts w:eastAsiaTheme="minorHAnsi"/>
+                <w:szCs w:val="21"/>
+              </w:rPr>
+              <w:t>中</w:t>
+            </w:r>
+          </w:p>
+        </w:tc>
+      </w:tr>
+      <w:tr>
+        <w:trPr>
+          <w:cantSplit/>
+          <w:jc w:val="center"/>
+        </w:trPr>
+        <w:tc>
+          <w:tcPr>
+            <w:tcW w:w="2552" w:type="dxa"/>
+          </w:tcPr>
+          <w:p>
+            <w:pPr>
+              <w:spacing w:before="30" w:after="30" w:line="276" w:lineRule="auto"/>
+              <w:jc w:val="center"/>
+              <w:rPr>
+                <w:rFonts w:eastAsiaTheme="minorHAnsi"/>
+                <w:szCs w:val="21"/>
+              </w:rPr>
+            </w:pPr>
+            <w:r>
+              <w:rPr>
+                <w:rFonts w:eastAsiaTheme="minorHAnsi"/>
+                <w:szCs w:val="21"/>
+              </w:rPr>
+              <w:t>千星奇域</w:t>
+            </w:r>
+          </w:p>
+        </w:tc>
+        <w:tc>
+          <w:tcPr>
+            <w:tcW w:w="1559" w:type="dxa"/>
+          </w:tcPr>
+          <w:p>
+            <w:pPr>
+              <w:spacing w:before="30" w:after="30" w:line="276" w:lineRule="auto"/>
+              <w:jc w:val="center"/>
+              <w:rPr>
+                <w:rFonts w:eastAsiaTheme="minorHAnsi"/>
+                <w:szCs w:val="21"/>
+              </w:rPr>
+            </w:pPr>
+            <w:r>
+              <w:rPr>
+                <w:rFonts w:eastAsiaTheme="minorHAnsi"/>
+                <w:szCs w:val="21"/>
+              </w:rPr>
+              <w:t>长线</w:t>
+            </w:r>
+          </w:p>
+        </w:tc>
+        <w:tc>
+          <w:tcPr>
+            <w:tcW w:w="2977" w:type="dxa"/>
+          </w:tcPr>
+          <w:p>
+            <w:pPr>
+              <w:spacing w:before="30" w:after="30" w:line="276" w:lineRule="auto"/>
+              <w:jc w:val="center"/>
+              <w:rPr>
+                <w:rFonts w:eastAsiaTheme="minorHAnsi"/>
+                <w:szCs w:val="21"/>
+              </w:rPr>
+            </w:pPr>
+            <w:r>
+              <w:rPr>
+                <w:rFonts w:eastAsiaTheme="minorHAnsi"/>
+                <w:szCs w:val="21"/>
+              </w:rPr>
+              <w:t>UGC关卡</w:t>
+            </w:r>
+          </w:p>
+        </w:tc>
+        <w:tc>
+          <w:tcPr>
+            <w:tcW w:w="1134" w:type="dxa"/>
+          </w:tcPr>
+          <w:p>
+            <w:pPr>
+              <w:spacing w:before="30" w:after="30" w:line="276" w:lineRule="auto"/>
+              <w:jc w:val="center"/>
+              <w:rPr>
+                <w:rFonts w:eastAsiaTheme="minorHAnsi"/>
+                <w:szCs w:val="21"/>
+              </w:rPr>
+            </w:pPr>
+            <w:r>
+              <w:rPr>
+                <w:rFonts w:eastAsiaTheme="minorHAnsi"/>
+                <w:szCs w:val="21"/>
+              </w:rPr>
+              <w:t>高</w:t>
+            </w:r>
+          </w:p>
+        </w:tc>
+      </w:tr>
+      <w:tr>
+        <w:trPr>
+          <w:cantSplit/>
+          <w:jc w:val="center"/>
+        </w:trPr>
+        <w:tc>
+          <w:tcPr>
+            <w:tcW w:w="2552" w:type="dxa"/>
+          </w:tcPr>
+          <w:p>
+            <w:pPr>
+              <w:spacing w:before="30" w:after="30" w:line="276" w:lineRule="auto"/>
+              <w:jc w:val="center"/>
+              <w:rPr>
+                <w:rFonts w:eastAsiaTheme="minorHAnsi"/>
+                <w:szCs w:val="21"/>
+              </w:rPr>
+            </w:pPr>
+            <w:r>
+              <w:rPr>
+                <w:rFonts w:eastAsiaTheme="minorHAnsi"/>
+                <w:szCs w:val="21"/>
+              </w:rPr>
+              <w:t>砺行修远</w:t>
+            </w:r>
+          </w:p>
+        </w:tc>
+        <w:tc>
+          <w:tcPr>
+            <w:tcW w:w="1559" w:type="dxa"/>
+          </w:tcPr>
+          <w:p>
+            <w:pPr>
+              <w:spacing w:before="30" w:after="30" w:line="276" w:lineRule="auto"/>
+              <w:jc w:val="center"/>
+              <w:rPr>
+                <w:rFonts w:eastAsiaTheme="minorHAnsi"/>
+                <w:szCs w:val="21"/>
+              </w:rPr>
+            </w:pPr>
+            <w:r>
+              <w:rPr>
+                <w:rFonts w:eastAsiaTheme="minorHAnsi"/>
+                <w:szCs w:val="21"/>
+              </w:rPr>
+              <w:t>年</w:t>
+            </w:r>
+          </w:p>
+        </w:tc>
+        <w:tc>
+          <w:tcPr>
+            <w:tcW w:w="2977" w:type="dxa"/>
+          </w:tcPr>
+          <w:p>
+            <w:pPr>
+              <w:spacing w:before="30" w:after="30" w:line="276" w:lineRule="auto"/>
+              <w:jc w:val="center"/>
+              <w:rPr>
+                <w:rFonts w:eastAsiaTheme="minorHAnsi"/>
+                <w:szCs w:val="21"/>
+              </w:rPr>
+            </w:pPr>
+            <w:r>
+              <w:rPr>
+                <w:rFonts w:eastAsiaTheme="minorHAnsi"/>
+                <w:szCs w:val="21"/>
+              </w:rPr>
+              <w:t>命星</w:t>
+            </w:r>
+          </w:p>
+        </w:tc>
+        <w:tc>
+          <w:tcPr>
+            <w:tcW w:w="1134" w:type="dxa"/>
+          </w:tcPr>
+          <w:p>
+            <w:pPr>
+              <w:spacing w:before="30" w:after="30" w:line="276" w:lineRule="auto"/>
+              <w:jc w:val="center"/>
+              <w:rPr>
+                <w:rFonts w:eastAsiaTheme="minorHAnsi"/>
+                <w:szCs w:val="21"/>
+              </w:rPr>
+            </w:pPr>
+            <w:r>
+              <w:rPr>
+                <w:rFonts w:eastAsiaTheme="minorHAnsi"/>
+                <w:szCs w:val="21"/>
+              </w:rPr>
+              <w:t>高</w:t>
+            </w:r>
+          </w:p>
+        </w:tc>
+      </w:tr>
+      <w:tr>
+        <w:trPr>
+          <w:cantSplit/>
+          <w:jc w:val="center"/>
+        </w:trPr>
+        <w:tc>
+          <w:tcPr>
+            <w:tcW w:w="2552" w:type="dxa"/>
+          </w:tcPr>
+          <w:p>
+            <w:pPr>
+              <w:spacing w:before="30" w:after="30" w:line="276" w:lineRule="auto"/>
+              <w:jc w:val="center"/>
+              <w:rPr>
+                <w:rFonts w:eastAsiaTheme="minorHAnsi"/>
+                <w:szCs w:val="21"/>
+              </w:rPr>
+            </w:pPr>
+            <w:r>
+              <w:rPr>
+                <w:rFonts w:eastAsiaTheme="minorHAnsi"/>
+                <w:szCs w:val="21"/>
+              </w:rPr>
+              <w:t>成就 / 图鉴</w:t>
+            </w:r>
+          </w:p>
+        </w:tc>
+        <w:tc>
+          <w:tcPr>
+            <w:tcW w:w="1559" w:type="dxa"/>
+          </w:tcPr>
+          <w:p>
+            <w:pPr>
+              <w:spacing w:before="30" w:after="30" w:line="276" w:lineRule="auto"/>
+              <w:jc w:val="center"/>
+              <w:rPr>
+                <w:rFonts w:eastAsiaTheme="minorHAnsi"/>
+                <w:szCs w:val="21"/>
+              </w:rPr>
+            </w:pPr>
+            <w:r>
+              <w:rPr>
+                <w:rFonts w:eastAsiaTheme="minorHAnsi"/>
+                <w:szCs w:val="21"/>
+              </w:rPr>
+              <w:t>长线</w:t>
+            </w:r>
+          </w:p>
+        </w:tc>
+        <w:tc>
+          <w:tcPr>
+            <w:tcW w:w="2977" w:type="dxa"/>
+          </w:tcPr>
+          <w:p>
+            <w:pPr>
+              <w:spacing w:before="30" w:after="30" w:line="276" w:lineRule="auto"/>
+              <w:jc w:val="center"/>
+              <w:rPr>
+                <w:rFonts w:eastAsiaTheme="minorHAnsi"/>
+                <w:szCs w:val="21"/>
+              </w:rPr>
+            </w:pPr>
+            <w:r>
+              <w:rPr>
+                <w:rFonts w:eastAsiaTheme="minorHAnsi"/>
+                <w:szCs w:val="21"/>
+              </w:rPr>
+              <w:t>收集完成度</w:t>
+            </w:r>
+          </w:p>
+        </w:tc>
+        <w:tc>
+          <w:tcPr>
+            <w:tcW w:w="1134" w:type="dxa"/>
+          </w:tcPr>
+          <w:p>
+            <w:pPr>
+              <w:spacing w:before="30" w:after="30" w:line="276" w:lineRule="auto"/>
+              <w:jc w:val="center"/>
+              <w:rPr>
+                <w:rFonts w:eastAsiaTheme="minorHAnsi"/>
+                <w:szCs w:val="21"/>
+              </w:rPr>
+            </w:pPr>
+            <w:r>
+              <w:rPr>
+                <w:rFonts w:eastAsiaTheme="minorHAnsi"/>
+                <w:szCs w:val="21"/>
+              </w:rPr>
+              <w:t>高</w:t>
+            </w:r>
+          </w:p>
+        </w:tc>
+      </w:tr>
+    </w:tbl>
+    <w:p>
+      <w:pPr>
+        <w:ind w:firstLineChars="200" w:firstLine="420"/>
+        <w:rPr>
+          <w:rFonts w:eastAsiaTheme="minorHAnsi"/>
+          <w:szCs w:val="21"/>
+        </w:rPr>
+      </w:pPr>
+      <w:r>
+        <w:rPr>
+          <w:rFonts w:eastAsiaTheme="minorHAnsi"/>
+          <w:szCs w:val="21"/>
+        </w:rPr>
+        <w:t>频率越高的系统，越不提供新体验。 日更和周更的四件（委托、树脂、纪行、周本）</w:t>
+      </w:r>
+      <w:r>
+        <w:rPr>
+          <w:rFonts w:eastAsiaTheme="minorHAnsi" w:hint="eastAsia"/>
+          <w:szCs w:val="21"/>
+        </w:rPr>
+        <w:t>的结算奖励为养成资源</w:t>
+      </w:r>
+      <w:r>
+        <w:rPr>
+          <w:rFonts w:eastAsiaTheme="minorHAnsi"/>
+          <w:szCs w:val="21"/>
+        </w:rPr>
+        <w:t>；提供新体验的四件（探索、剧情、活动、千星）</w:t>
+      </w:r>
+      <w:r>
+        <w:rPr>
+          <w:rFonts w:eastAsiaTheme="minorHAnsi" w:hint="eastAsia"/>
+          <w:szCs w:val="21"/>
+        </w:rPr>
+        <w:t>周期为版本或以年回馈。</w:t>
+      </w:r>
+    </w:p>
+    <w:p>
+      <w:pPr>
+        <w:ind w:firstLine="420"/>
+        <w:rPr>
+          <w:rFonts w:eastAsiaTheme="minorHAnsi"/>
+          <w:szCs w:val="21"/>
+        </w:rPr>
+      </w:pPr>
+      <w:r>
+        <w:rPr>
+          <w:rFonts w:eastAsiaTheme="minorHAnsi" w:hint="eastAsia"/>
+          <w:szCs w:val="21"/>
+        </w:rPr>
+        <w:t>即当前版本的游戏节奏下，玩家消耗内容的速度始终过于快速，随后将会进入一个高AFK概率周期，该周期内玩家仅能获得经济类资源回报。</w:t>
+      </w:r>
+    </w:p>
+    <w:p>
+      <w:pPr>
+        <w:ind w:firstLine="420"/>
+        <w:rPr>
+          <w:rFonts w:eastAsiaTheme="minorHAnsi" w:hint="eastAsia"/>
+          <w:szCs w:val="21"/>
+        </w:rPr>
+      </w:pPr>
+      <w:r>
+        <w:rPr>
+          <w:rFonts w:eastAsiaTheme="minorHAnsi" w:hint="eastAsia"/>
+          <w:szCs w:val="21"/>
+        </w:rPr>
+        <w:t>系统需要提供一个减少玩家内容消耗速度，或提高内容生产效率的方法。从而使玩家脱离该周期。</w:t>
+      </w:r>
+    </w:p>
+    <w:p>
+      <w:pPr>
+        <w:rPr>
+          <w:rFonts w:eastAsiaTheme="minorHAnsi"/>
+          <w:szCs w:val="21"/>
+        </w:rPr>
+      </w:pPr>
+    </w:p>
+    <w:p>
+      <w:pPr>
+        <w:rPr>
+          <w:rFonts w:eastAsiaTheme="minorHAnsi"/>
           <w:sz w:val="22"/>
           <w:szCs w:val="22"/>
         </w:rPr>
       </w:pPr>
-    </w:p>
-    <w:p>
-      <w:pPr>
-        <w:rPr>
-          <w:rFonts w:eastAsiaTheme="minorHAnsi"/>
+      <w:r>
+        <w:rPr>
+          <w:rFonts w:eastAsiaTheme="minorHAnsi" w:hint="eastAsia"/>
           <w:sz w:val="22"/>
           <w:szCs w:val="22"/>
         </w:rPr>
-      </w:pPr>
+        <w:t>3.</w:t>
+      </w:r>
       <w:r>
         <w:rPr>
           <w:rFonts w:eastAsiaTheme="minorHAnsi" w:hint="eastAsia"/>
           <w:sz w:val="22"/>
           <w:szCs w:val="22"/>
         </w:rPr>
-        <w:t>3.</w:t>
+        <w:t>2</w:t>
       </w:r>
       <w:r>
         <w:rPr>
@@ -2625,7 +4311,7 @@
           <w:sz w:val="22"/>
           <w:szCs w:val="22"/>
         </w:rPr>
-        <w:t>2</w:t>
+        <w:t xml:space="preserve">.2 </w:t>
       </w:r>
       <w:r>
         <w:rPr>
@@ -2633,7 +4319,7 @@
           <w:sz w:val="22"/>
           <w:szCs w:val="22"/>
         </w:rPr>
-        <w:t>.2 日档</w:t>
+        <w:t>玩家节奏档位分布</w:t>
       </w:r>
     </w:p>
     <w:p>
@@ -2644,46 +4330,426 @@
           <w:szCs w:val="22"/>
         </w:rPr>
       </w:pPr>
-      <w:r>
+    </w:p>
+    <w:tbl>
+      <w:tblPr>
+        <w:tblW w:w="8731" w:type="dxa"/>
+        <w:jc w:val="center"/>
+        <w:tblBorders>
+          <w:top w:val="single" w:sz="4" w:space="0" w:color="D5DCE2"/>
+          <w:left w:val="single" w:sz="4" w:space="0" w:color="D5DCE2"/>
+          <w:bottom w:val="single" w:sz="4" w:space="0" w:color="D5DCE2"/>
+          <w:right w:val="single" w:sz="4" w:space="0" w:color="D5DCE2"/>
+          <w:insideH w:val="single" w:sz="4" w:space="0" w:color="D5DCE2"/>
+          <w:insideV w:val="single" w:sz="4" w:space="0" w:color="D5DCE2"/>
+        </w:tblBorders>
+        <w:tblLayout w:type="fixed"/>
+        <w:tblLook w:val="04A0" w:firstRow="1" w:lastRow="0" w:firstColumn="1" w:lastColumn="0" w:noHBand="0" w:noVBand="1"/>
+      </w:tblPr>
+      <w:tblGrid>
+        <w:gridCol w:w="1061"/>
+        <w:gridCol w:w="4545"/>
+        <w:gridCol w:w="3125"/>
+      </w:tblGrid>
+      <w:tr>
+        <w:trPr>
+          <w:tblHeader/>
+          <w:jc w:val="center"/>
+        </w:trPr>
+        <w:tc>
+          <w:tcPr>
+            <w:tcW w:w="1061" w:type="dxa"/>
+            <w:shd w:val="clear" w:color="auto" w:fill="EEF2F6"/>
+          </w:tcPr>
+          <w:p>
+            <w:pPr>
+              <w:spacing w:before="30" w:after="30" w:line="276" w:lineRule="auto"/>
+              <w:jc w:val="center"/>
+              <w:rPr>
+                <w:rFonts w:eastAsiaTheme="minorHAnsi"/>
+                <w:szCs w:val="21"/>
+              </w:rPr>
+            </w:pPr>
+            <w:r>
+              <w:rPr>
+                <w:rFonts w:eastAsiaTheme="minorHAnsi"/>
+                <w:b/>
+                <w:szCs w:val="21"/>
+              </w:rPr>
+              <w:t>档位</w:t>
+            </w:r>
+          </w:p>
+        </w:tc>
+        <w:tc>
+          <w:tcPr>
+            <w:tcW w:w="4545" w:type="dxa"/>
+            <w:shd w:val="clear" w:color="auto" w:fill="EEF2F6"/>
+          </w:tcPr>
+          <w:p>
+            <w:pPr>
+              <w:spacing w:before="30" w:after="30" w:line="276" w:lineRule="auto"/>
+              <w:jc w:val="center"/>
+              <w:rPr>
+                <w:rFonts w:eastAsiaTheme="minorHAnsi"/>
+                <w:szCs w:val="21"/>
+              </w:rPr>
+            </w:pPr>
+            <w:r>
+              <w:rPr>
+                <w:rFonts w:eastAsiaTheme="minorHAnsi"/>
+                <w:b/>
+                <w:szCs w:val="21"/>
+              </w:rPr>
+              <w:t>刷新什么</w:t>
+            </w:r>
+          </w:p>
+        </w:tc>
+        <w:tc>
+          <w:tcPr>
+            <w:tcW w:w="3125" w:type="dxa"/>
+            <w:shd w:val="clear" w:color="auto" w:fill="EEF2F6"/>
+          </w:tcPr>
+          <w:p>
+            <w:pPr>
+              <w:spacing w:before="30" w:after="30" w:line="276" w:lineRule="auto"/>
+              <w:jc w:val="center"/>
+              <w:rPr>
+                <w:rFonts w:eastAsiaTheme="minorHAnsi"/>
+                <w:szCs w:val="21"/>
+              </w:rPr>
+            </w:pPr>
+            <w:r>
+              <w:rPr>
+                <w:rFonts w:eastAsiaTheme="minorHAnsi"/>
+                <w:b/>
+                <w:szCs w:val="21"/>
+              </w:rPr>
+              <w:t>玩家的实际所得</w:t>
+            </w:r>
+          </w:p>
+        </w:tc>
+      </w:tr>
+      <w:tr>
+        <w:trPr>
+          <w:cantSplit/>
+          <w:jc w:val="center"/>
+        </w:trPr>
+        <w:tc>
+          <w:tcPr>
+            <w:tcW w:w="1061" w:type="dxa"/>
+          </w:tcPr>
+          <w:p>
+            <w:pPr>
+              <w:spacing w:before="30" w:after="30" w:line="276" w:lineRule="auto"/>
+              <w:jc w:val="center"/>
+              <w:rPr>
+                <w:rFonts w:eastAsiaTheme="minorHAnsi"/>
+                <w:szCs w:val="21"/>
+              </w:rPr>
+            </w:pPr>
+            <w:r>
+              <w:rPr>
+                <w:rFonts w:eastAsiaTheme="minorHAnsi"/>
+                <w:szCs w:val="21"/>
+              </w:rPr>
+              <w:t>日</w:t>
+            </w:r>
+          </w:p>
+        </w:tc>
+        <w:tc>
+          <w:tcPr>
+            <w:tcW w:w="4545" w:type="dxa"/>
+          </w:tcPr>
+          <w:p>
+            <w:pPr>
+              <w:spacing w:before="30" w:after="30" w:line="276" w:lineRule="auto"/>
+              <w:rPr>
+                <w:rFonts w:eastAsiaTheme="minorHAnsi"/>
+                <w:szCs w:val="21"/>
+              </w:rPr>
+            </w:pPr>
+            <w:r>
+              <w:rPr>
+                <w:rFonts w:eastAsiaTheme="minorHAnsi"/>
+                <w:szCs w:val="21"/>
+              </w:rPr>
+              <w:t>4 次委托奖励、160 树脂</w:t>
+            </w:r>
+          </w:p>
+        </w:tc>
+        <w:tc>
+          <w:tcPr>
+            <w:tcW w:w="3125" w:type="dxa"/>
+          </w:tcPr>
+          <w:p>
+            <w:pPr>
+              <w:spacing w:before="30" w:after="30" w:line="276" w:lineRule="auto"/>
+              <w:rPr>
+                <w:rFonts w:eastAsiaTheme="minorHAnsi"/>
+                <w:szCs w:val="21"/>
+              </w:rPr>
+            </w:pPr>
+            <w:r>
+              <w:rPr>
+                <w:rFonts w:eastAsiaTheme="minorHAnsi"/>
+                <w:szCs w:val="21"/>
+              </w:rPr>
+              <w:t>资源结算</w:t>
+            </w:r>
+          </w:p>
+        </w:tc>
+      </w:tr>
+      <w:tr>
+        <w:trPr>
+          <w:cantSplit/>
+          <w:jc w:val="center"/>
+        </w:trPr>
+        <w:tc>
+          <w:tcPr>
+            <w:tcW w:w="1061" w:type="dxa"/>
+          </w:tcPr>
+          <w:p>
+            <w:pPr>
+              <w:spacing w:before="30" w:after="30" w:line="276" w:lineRule="auto"/>
+              <w:jc w:val="center"/>
+              <w:rPr>
+                <w:rFonts w:eastAsiaTheme="minorHAnsi"/>
+                <w:szCs w:val="21"/>
+              </w:rPr>
+            </w:pPr>
+            <w:r>
+              <w:rPr>
+                <w:rFonts w:eastAsiaTheme="minorHAnsi"/>
+                <w:szCs w:val="21"/>
+              </w:rPr>
+              <w:t>周</w:t>
+            </w:r>
+          </w:p>
+        </w:tc>
+        <w:tc>
+          <w:tcPr>
+            <w:tcW w:w="4545" w:type="dxa"/>
+          </w:tcPr>
+          <w:p>
+            <w:pPr>
+              <w:spacing w:before="30" w:after="30" w:line="276" w:lineRule="auto"/>
+              <w:rPr>
+                <w:rFonts w:eastAsiaTheme="minorHAnsi"/>
+                <w:szCs w:val="21"/>
+              </w:rPr>
+            </w:pPr>
+            <w:r>
+              <w:rPr>
+                <w:rFonts w:eastAsiaTheme="minorHAnsi"/>
+                <w:szCs w:val="21"/>
+              </w:rPr>
+              <w:t>纪行计数、周本半价、洞天宝钱额度</w:t>
+            </w:r>
+          </w:p>
+        </w:tc>
+        <w:tc>
+          <w:tcPr>
+            <w:tcW w:w="3125" w:type="dxa"/>
+          </w:tcPr>
+          <w:p>
+            <w:pPr>
+              <w:spacing w:before="30" w:after="30" w:line="276" w:lineRule="auto"/>
+              <w:rPr>
+                <w:rFonts w:eastAsiaTheme="minorHAnsi"/>
+                <w:szCs w:val="21"/>
+              </w:rPr>
+            </w:pPr>
+            <w:r>
+              <w:rPr>
+                <w:rFonts w:eastAsiaTheme="minorHAnsi"/>
+                <w:szCs w:val="21"/>
+              </w:rPr>
+              <w:t>额度</w:t>
+            </w:r>
+          </w:p>
+        </w:tc>
+      </w:tr>
+      <w:tr>
+        <w:trPr>
+          <w:cantSplit/>
+          <w:jc w:val="center"/>
+        </w:trPr>
+        <w:tc>
+          <w:tcPr>
+            <w:tcW w:w="1061" w:type="dxa"/>
+          </w:tcPr>
+          <w:p>
+            <w:pPr>
+              <w:spacing w:before="30" w:after="30" w:line="276" w:lineRule="auto"/>
+              <w:jc w:val="center"/>
+              <w:rPr>
+                <w:rFonts w:eastAsiaTheme="minorHAnsi"/>
+                <w:szCs w:val="21"/>
+              </w:rPr>
+            </w:pPr>
+            <w:r>
+              <w:rPr>
+                <w:rFonts w:eastAsiaTheme="minorHAnsi"/>
+                <w:szCs w:val="21"/>
+              </w:rPr>
+              <w:t>月</w:t>
+            </w:r>
+          </w:p>
+        </w:tc>
+        <w:tc>
+          <w:tcPr>
+            <w:tcW w:w="4545" w:type="dxa"/>
+          </w:tcPr>
+          <w:p>
+            <w:pPr>
+              <w:spacing w:before="30" w:after="30" w:line="276" w:lineRule="auto"/>
+              <w:rPr>
+                <w:rFonts w:eastAsiaTheme="minorHAnsi"/>
+                <w:szCs w:val="21"/>
+              </w:rPr>
+            </w:pPr>
+            <w:r>
+              <w:rPr>
+                <w:rFonts w:eastAsiaTheme="minorHAnsi"/>
+                <w:szCs w:val="21"/>
+              </w:rPr>
+              <w:t>深渊（16 日）、剧诗（1 日）</w:t>
+            </w:r>
+          </w:p>
+        </w:tc>
+        <w:tc>
+          <w:tcPr>
+            <w:tcW w:w="3125" w:type="dxa"/>
+          </w:tcPr>
+          <w:p>
+            <w:pPr>
+              <w:spacing w:before="30" w:after="30" w:line="276" w:lineRule="auto"/>
+              <w:rPr>
+                <w:rFonts w:eastAsiaTheme="minorHAnsi"/>
+                <w:szCs w:val="21"/>
+              </w:rPr>
+            </w:pPr>
+            <w:r>
+              <w:rPr>
+                <w:rFonts w:eastAsiaTheme="minorHAnsi"/>
+                <w:szCs w:val="21"/>
+              </w:rPr>
+              <w:t>练度与角色池检验</w:t>
+            </w:r>
+          </w:p>
+        </w:tc>
+      </w:tr>
+      <w:tr>
+        <w:trPr>
+          <w:cantSplit/>
+          <w:jc w:val="center"/>
+        </w:trPr>
+        <w:tc>
+          <w:tcPr>
+            <w:tcW w:w="1061" w:type="dxa"/>
+          </w:tcPr>
+          <w:p>
+            <w:pPr>
+              <w:spacing w:before="30" w:after="30" w:line="276" w:lineRule="auto"/>
+              <w:jc w:val="center"/>
+              <w:rPr>
+                <w:rFonts w:eastAsiaTheme="minorHAnsi"/>
+                <w:szCs w:val="21"/>
+              </w:rPr>
+            </w:pPr>
+            <w:r>
+              <w:rPr>
+                <w:rFonts w:eastAsiaTheme="minorHAnsi"/>
+                <w:szCs w:val="21"/>
+              </w:rPr>
+              <w:t>版本</w:t>
+            </w:r>
+          </w:p>
+        </w:tc>
+        <w:tc>
+          <w:tcPr>
+            <w:tcW w:w="4545" w:type="dxa"/>
+          </w:tcPr>
+          <w:p>
+            <w:pPr>
+              <w:spacing w:before="30" w:after="30" w:line="276" w:lineRule="auto"/>
+              <w:rPr>
+                <w:rFonts w:eastAsiaTheme="minorHAnsi"/>
+                <w:szCs w:val="21"/>
+              </w:rPr>
+            </w:pPr>
+            <w:r>
+              <w:rPr>
+                <w:rFonts w:eastAsiaTheme="minorHAnsi"/>
+                <w:szCs w:val="21"/>
+              </w:rPr>
+              <w:t>地图、剧情、活动、卡池</w:t>
+            </w:r>
+          </w:p>
+        </w:tc>
+        <w:tc>
+          <w:tcPr>
+            <w:tcW w:w="3125" w:type="dxa"/>
+          </w:tcPr>
+          <w:p>
+            <w:pPr>
+              <w:spacing w:before="30" w:after="30" w:line="276" w:lineRule="auto"/>
+              <w:rPr>
+                <w:rFonts w:eastAsiaTheme="minorHAnsi"/>
+                <w:szCs w:val="21"/>
+              </w:rPr>
+            </w:pPr>
+            <w:r>
+              <w:rPr>
+                <w:rFonts w:eastAsiaTheme="minorHAnsi"/>
+                <w:szCs w:val="21"/>
+              </w:rPr>
+              <w:t>一次性体验，集中在首周</w:t>
+            </w:r>
+          </w:p>
+        </w:tc>
+      </w:tr>
+    </w:tbl>
+    <w:p>
+      <w:pPr>
         <w:rPr>
           <w:rFonts w:eastAsiaTheme="minorHAnsi" w:hint="eastAsia"/>
           <w:sz w:val="22"/>
           <w:szCs w:val="22"/>
         </w:rPr>
-        <w:t>3.</w:t>
-      </w:r>
-      <w:r>
-        <w:rPr>
-          <w:rFonts w:eastAsiaTheme="minorHAnsi" w:hint="eastAsia"/>
+      </w:pPr>
+    </w:p>
+    <w:p>
+      <w:pPr>
+        <w:rPr>
+          <w:rFonts w:eastAsiaTheme="minorHAnsi"/>
           <w:sz w:val="22"/>
           <w:szCs w:val="22"/>
         </w:rPr>
-        <w:t>2</w:t>
-      </w:r>
+      </w:pPr>
       <w:r>
         <w:rPr>
           <w:rFonts w:eastAsiaTheme="minorHAnsi" w:hint="eastAsia"/>
           <w:sz w:val="22"/>
           <w:szCs w:val="22"/>
         </w:rPr>
-        <w:t>.3 周档</w:t>
-      </w:r>
-    </w:p>
-    <w:p>
-      <w:pPr>
-        <w:rPr>
-          <w:rFonts w:eastAsiaTheme="minorHAnsi"/>
+        <w:t>3.</w:t>
+      </w:r>
+      <w:r>
+        <w:rPr>
+          <w:rFonts w:eastAsiaTheme="minorHAnsi" w:hint="eastAsia"/>
           <w:sz w:val="22"/>
           <w:szCs w:val="22"/>
         </w:rPr>
-      </w:pPr>
+        <w:t>2</w:t>
+      </w:r>
       <w:r>
         <w:rPr>
           <w:rFonts w:eastAsiaTheme="minorHAnsi" w:hint="eastAsia"/>
           <w:sz w:val="22"/>
           <w:szCs w:val="22"/>
         </w:rPr>
-        <w:t>3.</w:t>
+        <w:t>.</w:t>
       </w:r>
       <w:r>
         <w:rPr>
@@ -2691,7 +4757,7 @@
           <w:sz w:val="22"/>
           <w:szCs w:val="22"/>
         </w:rPr>
-        <w:t>2</w:t>
+        <w:t>3</w:t>
       </w:r>
       <w:r>
         <w:rPr>
@@ -2699,90 +4765,7 @@
           <w:sz w:val="22"/>
           <w:szCs w:val="22"/>
         </w:rPr>
-        <w:t>.4 半月档</w:t>
-      </w:r>
-    </w:p>
-    <w:p>
-      <w:pPr>
-        <w:rPr>
-          <w:rFonts w:eastAsiaTheme="minorHAnsi"/>
-          <w:sz w:val="22"/>
-          <w:szCs w:val="22"/>
-        </w:rPr>
-      </w:pPr>
-      <w:r>
-        <w:rPr>
-          <w:rFonts w:eastAsiaTheme="minorHAnsi" w:hint="eastAsia"/>
-          <w:sz w:val="22"/>
-          <w:szCs w:val="22"/>
-        </w:rPr>
-        <w:t>3.</w:t>
-      </w:r>
-      <w:r>
-        <w:rPr>
-          <w:rFonts w:eastAsiaTheme="minorHAnsi" w:hint="eastAsia"/>
-          <w:sz w:val="22"/>
-          <w:szCs w:val="22"/>
-        </w:rPr>
-        <w:t>2</w:t>
-      </w:r>
-      <w:r>
-        <w:rPr>
-          <w:rFonts w:eastAsiaTheme="minorHAnsi" w:hint="eastAsia"/>
-          <w:sz w:val="22"/>
-          <w:szCs w:val="22"/>
-        </w:rPr>
-        <w:t xml:space="preserve">.5 </w:t>
-      </w:r>
-      <w:r>
-        <w:rPr>
-          <w:rFonts w:eastAsiaTheme="minorHAnsi" w:hint="eastAsia"/>
-          <w:sz w:val="22"/>
-          <w:szCs w:val="22"/>
-        </w:rPr>
-        <w:t>版本</w:t>
-      </w:r>
-      <w:r>
-        <w:rPr>
-          <w:rFonts w:eastAsiaTheme="minorHAnsi" w:hint="eastAsia"/>
-          <w:sz w:val="22"/>
-          <w:szCs w:val="22"/>
-        </w:rPr>
-        <w:t>档</w:t>
-      </w:r>
-    </w:p>
-    <w:p>
-      <w:pPr>
-        <w:rPr>
-          <w:rFonts w:eastAsiaTheme="minorHAnsi"/>
-          <w:sz w:val="22"/>
-          <w:szCs w:val="22"/>
-        </w:rPr>
-      </w:pPr>
-      <w:r>
-        <w:rPr>
-          <w:rFonts w:eastAsiaTheme="minorHAnsi" w:hint="eastAsia"/>
-          <w:sz w:val="22"/>
-          <w:szCs w:val="22"/>
-        </w:rPr>
-        <w:lastRenderedPageBreak/>
-        <w:t>3.</w:t>
-      </w:r>
-      <w:r>
-        <w:rPr>
-          <w:rFonts w:eastAsiaTheme="minorHAnsi" w:hint="eastAsia"/>
-          <w:sz w:val="22"/>
-          <w:szCs w:val="22"/>
-        </w:rPr>
-        <w:t>2</w:t>
-      </w:r>
-      <w:r>
-        <w:rPr>
-          <w:rFonts w:eastAsiaTheme="minorHAnsi" w:hint="eastAsia"/>
-          <w:sz w:val="22"/>
-          <w:szCs w:val="22"/>
-        </w:rPr>
-        <w:t>.6 玩家活跃度的体验流程</w:t>
+        <w:t xml:space="preserve"> 玩家活跃度的体验流程</w:t>
       </w:r>
     </w:p>
     <w:p>
@@ -2912,6 +4895,7 @@
           <w:sz w:val="28"/>
           <w:szCs w:val="28"/>
         </w:rPr>
+        <w:lastRenderedPageBreak/>
         <w:t>4 问题</w:t>
       </w:r>
     </w:p>
@@ -3321,7 +5305,6 @@
           <w:rFonts w:eastAsiaTheme="minorHAnsi" w:hint="eastAsia"/>
           <w:sz w:val="24"/>
         </w:rPr>
-        <w:lastRenderedPageBreak/>
         <w:t>7.3</w:t>
       </w:r>
       <w:r>
@@ -3380,6 +5363,7 @@
           <w:sz w:val="28"/>
           <w:szCs w:val="28"/>
         </w:rPr>
+        <w:lastRenderedPageBreak/>
         <w:t>8 验收与测试</w:t>
       </w:r>
     </w:p>

</xml_diff>

<commit_message>
keep going anal the sys 02
</commit_message>
<xml_diff>
--- a/原神活跃度系统/原神活跃度系统拆解分析与迭代设计.docx
+++ b/原神活跃度系统/原神活跃度系统拆解分析与迭代设计.docx
@@ -4713,7 +4713,16 @@
     <w:p>
       <w:pPr>
         <w:rPr>
-          <w:rFonts w:eastAsiaTheme="minorHAnsi" w:hint="eastAsia"/>
+          <w:rFonts w:eastAsiaTheme="minorHAnsi"/>
+          <w:sz w:val="22"/>
+          <w:szCs w:val="22"/>
+        </w:rPr>
+      </w:pPr>
+    </w:p>
+    <w:p>
+      <w:pPr>
+        <w:rPr>
+          <w:rFonts w:eastAsiaTheme="minorHAnsi"/>
           <w:sz w:val="22"/>
           <w:szCs w:val="22"/>
         </w:rPr>

</xml_diff>